<commit_message>
maven class2 last update
</commit_message>
<xml_diff>
--- a/Maven_Notes/maven_class1.docx
+++ b/Maven_Notes/maven_class1.docx
@@ -13,6 +13,14 @@
       <w:r>
         <w:rPr>
           <w:rFonts w:cstheme="minorHAnsi"/>
+          <w:sz w:val="28"/>
+          <w:szCs w:val="24"/>
+        </w:rPr>
+        <w:t>S</w:t>
+      </w:r>
+      <w:r>
+        <w:rPr>
+          <w:rFonts w:cstheme="minorHAnsi"/>
           <w:noProof/>
           <w:sz w:val="28"/>
           <w:szCs w:val="24"/>
@@ -2446,6 +2454,7 @@
           <w:szCs w:val="24"/>
         </w:rPr>
       </w:pPr>
+      <w:bookmarkStart w:id="0" w:name="_GoBack"/>
       <w:proofErr w:type="gramStart"/>
       <w:r>
         <w:rPr>
@@ -2466,6 +2475,7 @@
         </w:rPr>
         <w:t xml:space="preserve"> install java-1.8.0-openjdk-devel -y</w:t>
       </w:r>
+      <w:bookmarkEnd w:id="0"/>
       <w:r>
         <w:rPr>
           <w:rFonts w:cstheme="minorHAnsi"/>
@@ -5008,6 +5018,7 @@
       <w:r>
         <w:rPr>
           <w:rFonts w:cstheme="minorHAnsi"/>
+          <w:noProof/>
           <w:sz w:val="28"/>
           <w:szCs w:val="24"/>
         </w:rPr>
@@ -5059,6 +5070,7 @@
       <w:r>
         <w:rPr>
           <w:rFonts w:cstheme="minorHAnsi"/>
+          <w:noProof/>
           <w:sz w:val="28"/>
           <w:szCs w:val="24"/>
         </w:rPr>
@@ -5170,6 +5182,7 @@
       <w:r>
         <w:rPr>
           <w:rFonts w:cstheme="minorHAnsi"/>
+          <w:noProof/>
           <w:color w:val="FF0000"/>
           <w:sz w:val="28"/>
           <w:szCs w:val="24"/>
@@ -5396,6 +5409,7 @@
       <w:r>
         <w:rPr>
           <w:rFonts w:cstheme="minorHAnsi"/>
+          <w:noProof/>
           <w:color w:val="FF0000"/>
           <w:sz w:val="28"/>
           <w:szCs w:val="24"/>
@@ -5542,6 +5556,7 @@
       <w:r>
         <w:rPr>
           <w:rFonts w:cstheme="minorHAnsi"/>
+          <w:noProof/>
           <w:sz w:val="28"/>
           <w:szCs w:val="24"/>
         </w:rPr>
@@ -5671,6 +5686,7 @@
       <w:r>
         <w:rPr>
           <w:rFonts w:cstheme="minorHAnsi"/>
+          <w:noProof/>
           <w:sz w:val="28"/>
           <w:szCs w:val="24"/>
         </w:rPr>
@@ -5745,8 +5761,6 @@
           <w:szCs w:val="24"/>
         </w:rPr>
       </w:pPr>
-      <w:bookmarkStart w:id="0" w:name="_GoBack"/>
-      <w:bookmarkEnd w:id="0"/>
     </w:p>
     <w:sectPr>
       <w:pgSz w:w="12240" w:h="15840"/>

</xml_diff>